<commit_message>
v0.4.8.6: wiki + reference pages, Mill merge, Cipher Chamber
</commit_message>
<xml_diff>
--- a/Rules.docx
+++ b/Rules.docx
@@ -1187,6 +1187,7 @@
               </w:rPr>
               <w:t xml:space="preserve"> (see </w:t>
             </w:r>
+            <w:proofErr w:type="spellStart"/>
             <w:r>
               <w:rPr>
                 <w:rFonts w:ascii="EB Garamond" w:hAnsi="EB Garamond" w:cs="EB Garamond"/>
@@ -1197,6 +1198,7 @@
               </w:rPr>
               <w:t>Vassalization</w:t>
             </w:r>
+            <w:proofErr w:type="spellEnd"/>
             <w:r>
               <w:rPr>
                 <w:rFonts w:ascii="EB Garamond" w:hAnsi="EB Garamond" w:cs="EB Garamond"/>
@@ -1418,7 +1420,25 @@
           <w:sz w:val="20"/>
           <w:szCs w:val="20"/>
         </w:rPr>
-        <w:t>When an Edict is completed, increase the Renown tracker by 1</w:t>
+        <w:t xml:space="preserve">When an Edict is completed, increase the </w:t>
+      </w:r>
+      <w:proofErr w:type="spellStart"/>
+      <w:r>
+        <w:rPr>
+          <w:rFonts w:ascii="EB Garamond" w:hAnsi="EB Garamond" w:cs="EB Garamond"/>
+          <w:sz w:val="20"/>
+          <w:szCs w:val="20"/>
+        </w:rPr>
+        <w:t>Renown</w:t>
+      </w:r>
+      <w:proofErr w:type="spellEnd"/>
+      <w:r>
+        <w:rPr>
+          <w:rFonts w:ascii="EB Garamond" w:hAnsi="EB Garamond" w:cs="EB Garamond"/>
+          <w:sz w:val="20"/>
+          <w:szCs w:val="20"/>
+        </w:rPr>
+        <w:t xml:space="preserve"> tracker by 1</w:t>
       </w:r>
       <w:r>
         <w:rPr>
@@ -1561,6 +1581,7 @@
           <w:szCs w:val="24"/>
         </w:rPr>
       </w:pPr>
+      <w:proofErr w:type="spellStart"/>
       <w:r>
         <w:rPr>
           <w:rFonts w:ascii="EB Garamond" w:hAnsi="EB Garamond" w:cs="EB Garamond"/>
@@ -1569,6 +1590,7 @@
         </w:rPr>
         <w:t>Vassalization</w:t>
       </w:r>
+      <w:proofErr w:type="spellEnd"/>
     </w:p>
     <w:p>
       <w:pPr>
@@ -1748,7 +1770,25 @@
           <w:sz w:val="20"/>
           <w:szCs w:val="20"/>
         </w:rPr>
-        <w:t xml:space="preserve"> under it’s </w:t>
+        <w:t xml:space="preserve"> under </w:t>
+      </w:r>
+      <w:proofErr w:type="spellStart"/>
+      <w:r>
+        <w:rPr>
+          <w:rFonts w:ascii="EB Garamond" w:hAnsi="EB Garamond" w:cs="EB Garamond"/>
+          <w:sz w:val="20"/>
+          <w:szCs w:val="20"/>
+        </w:rPr>
+        <w:t>it’s</w:t>
+      </w:r>
+      <w:proofErr w:type="spellEnd"/>
+      <w:r>
+        <w:rPr>
+          <w:rFonts w:ascii="EB Garamond" w:hAnsi="EB Garamond" w:cs="EB Garamond"/>
+          <w:sz w:val="20"/>
+          <w:szCs w:val="20"/>
+        </w:rPr>
+        <w:t xml:space="preserve"> </w:t>
       </w:r>
       <w:r>
         <w:rPr>
@@ -2668,16 +2708,9 @@
           <w:sz w:val="16"/>
           <w:szCs w:val="16"/>
         </w:rPr>
-        <w:t xml:space="preserve">        A["Start of Turn&lt;br&gt;(Empire Phase)"] --&gt; B["Council Phase"]    </w:t>
-      </w:r>
-      <w:r>
-        <w:rPr>
-          <w:rFonts w:ascii="EB Garamond" w:hAnsi="EB Garamond" w:cs="EB Garamond"/>
-          <w:sz w:val="20"/>
-          <w:szCs w:val="20"/>
-        </w:rPr>
-        <w:br/>
-      </w:r>
+        <w:t xml:space="preserve">        A["Start of Turn&lt;</w:t>
+      </w:r>
+      <w:proofErr w:type="spellStart"/>
       <w:r>
         <w:rPr>
           <w:rFonts w:ascii="EB Garamond" w:eastAsia="Courier New" w:hAnsi="EB Garamond" w:cs="EB Garamond"/>
@@ -2685,8 +2718,9 @@
           <w:sz w:val="16"/>
           <w:szCs w:val="16"/>
         </w:rPr>
-        <w:t xml:space="preserve">        B --&gt; C["Envoy Phase&lt;br&gt;(</w:t>
-      </w:r>
+        <w:t>br</w:t>
+      </w:r>
+      <w:proofErr w:type="spellEnd"/>
       <w:r>
         <w:rPr>
           <w:rFonts w:ascii="EB Garamond" w:eastAsia="Courier New" w:hAnsi="EB Garamond" w:cs="EB Garamond"/>
@@ -2694,7 +2728,15 @@
           <w:sz w:val="16"/>
           <w:szCs w:val="16"/>
         </w:rPr>
-        <w:t>Diplomacy</w:t>
+        <w:t xml:space="preserve">&gt;(Empire Phase)"] --&gt; B["Council Phase"]    </w:t>
+      </w:r>
+      <w:r>
+        <w:rPr>
+          <w:rFonts w:ascii="EB Garamond" w:hAnsi="EB Garamond" w:cs="EB Garamond"/>
+          <w:sz w:val="20"/>
+          <w:szCs w:val="20"/>
+        </w:rPr>
+        <w:br/>
       </w:r>
       <w:r>
         <w:rPr>
@@ -2703,16 +2745,9 @@
           <w:sz w:val="16"/>
           <w:szCs w:val="16"/>
         </w:rPr>
-        <w:t xml:space="preserve"> Envoys → Domain Envoys)"]    </w:t>
-      </w:r>
-      <w:r>
-        <w:rPr>
-          <w:rFonts w:ascii="EB Garamond" w:hAnsi="EB Garamond" w:cs="EB Garamond"/>
-          <w:sz w:val="20"/>
-          <w:szCs w:val="20"/>
-        </w:rPr>
-        <w:br/>
-      </w:r>
+        <w:t xml:space="preserve">        B --&gt; C["Envoy Phase&lt;</w:t>
+      </w:r>
+      <w:proofErr w:type="spellStart"/>
       <w:r>
         <w:rPr>
           <w:rFonts w:ascii="EB Garamond" w:eastAsia="Courier New" w:hAnsi="EB Garamond" w:cs="EB Garamond"/>
@@ -2720,16 +2755,9 @@
           <w:sz w:val="16"/>
           <w:szCs w:val="16"/>
         </w:rPr>
-        <w:t xml:space="preserve">        C --&gt; D["Battle Phase&lt;br&gt;(Skirmishes, Sieges, Battles)"]    </w:t>
-      </w:r>
-      <w:r>
-        <w:rPr>
-          <w:rFonts w:ascii="EB Garamond" w:hAnsi="EB Garamond" w:cs="EB Garamond"/>
-          <w:sz w:val="20"/>
-          <w:szCs w:val="20"/>
-        </w:rPr>
-        <w:br/>
-      </w:r>
+        <w:t>br</w:t>
+      </w:r>
+      <w:proofErr w:type="spellEnd"/>
       <w:r>
         <w:rPr>
           <w:rFonts w:ascii="EB Garamond" w:eastAsia="Courier New" w:hAnsi="EB Garamond" w:cs="EB Garamond"/>
@@ -2737,7 +2765,99 @@
           <w:sz w:val="16"/>
           <w:szCs w:val="16"/>
         </w:rPr>
-        <w:t xml:space="preserve">        D --&gt; E["Rest Phase&lt;br&gt;(Cleanup → Season +1 → Renown → Spend Domain Point → Pass Host)"]    </w:t>
+        <w:t>&gt;(</w:t>
+      </w:r>
+      <w:r>
+        <w:rPr>
+          <w:rFonts w:ascii="EB Garamond" w:eastAsia="Courier New" w:hAnsi="EB Garamond" w:cs="EB Garamond"/>
+          <w:color w:val="FFFFFF"/>
+          <w:sz w:val="16"/>
+          <w:szCs w:val="16"/>
+        </w:rPr>
+        <w:t>Diplomacy</w:t>
+      </w:r>
+      <w:r>
+        <w:rPr>
+          <w:rFonts w:ascii="EB Garamond" w:eastAsia="Courier New" w:hAnsi="EB Garamond" w:cs="EB Garamond"/>
+          <w:color w:val="FFFFFF"/>
+          <w:sz w:val="16"/>
+          <w:szCs w:val="16"/>
+        </w:rPr>
+        <w:t xml:space="preserve"> Envoys → Domain Envoys)"]    </w:t>
+      </w:r>
+      <w:r>
+        <w:rPr>
+          <w:rFonts w:ascii="EB Garamond" w:hAnsi="EB Garamond" w:cs="EB Garamond"/>
+          <w:sz w:val="20"/>
+          <w:szCs w:val="20"/>
+        </w:rPr>
+        <w:br/>
+      </w:r>
+      <w:r>
+        <w:rPr>
+          <w:rFonts w:ascii="EB Garamond" w:eastAsia="Courier New" w:hAnsi="EB Garamond" w:cs="EB Garamond"/>
+          <w:color w:val="FFFFFF"/>
+          <w:sz w:val="16"/>
+          <w:szCs w:val="16"/>
+        </w:rPr>
+        <w:t xml:space="preserve">        C --&gt; D["Battle Phase&lt;</w:t>
+      </w:r>
+      <w:proofErr w:type="spellStart"/>
+      <w:r>
+        <w:rPr>
+          <w:rFonts w:ascii="EB Garamond" w:eastAsia="Courier New" w:hAnsi="EB Garamond" w:cs="EB Garamond"/>
+          <w:color w:val="FFFFFF"/>
+          <w:sz w:val="16"/>
+          <w:szCs w:val="16"/>
+        </w:rPr>
+        <w:t>br</w:t>
+      </w:r>
+      <w:proofErr w:type="spellEnd"/>
+      <w:r>
+        <w:rPr>
+          <w:rFonts w:ascii="EB Garamond" w:eastAsia="Courier New" w:hAnsi="EB Garamond" w:cs="EB Garamond"/>
+          <w:color w:val="FFFFFF"/>
+          <w:sz w:val="16"/>
+          <w:szCs w:val="16"/>
+        </w:rPr>
+        <w:t xml:space="preserve">&gt;(Skirmishes, Sieges, Battles)"]    </w:t>
+      </w:r>
+      <w:r>
+        <w:rPr>
+          <w:rFonts w:ascii="EB Garamond" w:hAnsi="EB Garamond" w:cs="EB Garamond"/>
+          <w:sz w:val="20"/>
+          <w:szCs w:val="20"/>
+        </w:rPr>
+        <w:br/>
+      </w:r>
+      <w:r>
+        <w:rPr>
+          <w:rFonts w:ascii="EB Garamond" w:eastAsia="Courier New" w:hAnsi="EB Garamond" w:cs="EB Garamond"/>
+          <w:color w:val="FFFFFF"/>
+          <w:sz w:val="16"/>
+          <w:szCs w:val="16"/>
+        </w:rPr>
+        <w:t xml:space="preserve">        D --&gt; E["Rest Phase&lt;</w:t>
+      </w:r>
+      <w:proofErr w:type="spellStart"/>
+      <w:r>
+        <w:rPr>
+          <w:rFonts w:ascii="EB Garamond" w:eastAsia="Courier New" w:hAnsi="EB Garamond" w:cs="EB Garamond"/>
+          <w:color w:val="FFFFFF"/>
+          <w:sz w:val="16"/>
+          <w:szCs w:val="16"/>
+        </w:rPr>
+        <w:t>br</w:t>
+      </w:r>
+      <w:proofErr w:type="spellEnd"/>
+      <w:r>
+        <w:rPr>
+          <w:rFonts w:ascii="EB Garamond" w:eastAsia="Courier New" w:hAnsi="EB Garamond" w:cs="EB Garamond"/>
+          <w:color w:val="FFFFFF"/>
+          <w:sz w:val="16"/>
+          <w:szCs w:val="16"/>
+        </w:rPr>
+        <w:t xml:space="preserve">&gt;(Cleanup → Season +1 → Renown → Spend Domain Point → Pass Host)"]    </w:t>
       </w:r>
       <w:r>
         <w:rPr>
@@ -19691,17 +19811,15 @@
                 <w:sz w:val="20"/>
                 <w:szCs w:val="20"/>
               </w:rPr>
-              <w:t xml:space="preserve">, gain </w:t>
-            </w:r>
-            <w:r>
-              <w:rPr>
-                <w:rFonts w:ascii="EB Garamond" w:hAnsi="EB Garamond" w:cs="EB Garamond"/>
-                <w:b/>
-                <w:bCs/>
-                <w:sz w:val="20"/>
-                <w:szCs w:val="20"/>
-              </w:rPr>
-              <w:t>Blocked.</w:t>
+              <w:t xml:space="preserve">, </w:t>
+            </w:r>
+            <w:r>
+              <w:rPr>
+                <w:rFonts w:ascii="EB Garamond" w:hAnsi="EB Garamond" w:cs="EB Garamond"/>
+                <w:sz w:val="20"/>
+                <w:szCs w:val="20"/>
+              </w:rPr>
+              <w:t>that army cannot perform a move action this turn or next.</w:t>
             </w:r>
           </w:p>
         </w:tc>
@@ -28003,7 +28121,51 @@
           <w:sz w:val="20"/>
           <w:szCs w:val="20"/>
         </w:rPr>
-        <w:t xml:space="preserve"> have build timer +1. Monuments have build timer +2. All other </w:t>
+        <w:t xml:space="preserve"> have </w:t>
+      </w:r>
+      <w:proofErr w:type="spellStart"/>
+      <w:r>
+        <w:rPr>
+          <w:rFonts w:ascii="EB Garamond" w:hAnsi="EB Garamond" w:cs="EB Garamond"/>
+          <w:i/>
+          <w:iCs/>
+          <w:sz w:val="20"/>
+          <w:szCs w:val="20"/>
+        </w:rPr>
+        <w:t>build</w:t>
+      </w:r>
+      <w:proofErr w:type="spellEnd"/>
+      <w:r>
+        <w:rPr>
+          <w:rFonts w:ascii="EB Garamond" w:hAnsi="EB Garamond" w:cs="EB Garamond"/>
+          <w:i/>
+          <w:iCs/>
+          <w:sz w:val="20"/>
+          <w:szCs w:val="20"/>
+        </w:rPr>
+        <w:t xml:space="preserve"> timer +1. Monuments have </w:t>
+      </w:r>
+      <w:proofErr w:type="spellStart"/>
+      <w:r>
+        <w:rPr>
+          <w:rFonts w:ascii="EB Garamond" w:hAnsi="EB Garamond" w:cs="EB Garamond"/>
+          <w:i/>
+          <w:iCs/>
+          <w:sz w:val="20"/>
+          <w:szCs w:val="20"/>
+        </w:rPr>
+        <w:t>build</w:t>
+      </w:r>
+      <w:proofErr w:type="spellEnd"/>
+      <w:r>
+        <w:rPr>
+          <w:rFonts w:ascii="EB Garamond" w:hAnsi="EB Garamond" w:cs="EB Garamond"/>
+          <w:i/>
+          <w:iCs/>
+          <w:sz w:val="20"/>
+          <w:szCs w:val="20"/>
+        </w:rPr>
+        <w:t xml:space="preserve"> timer +2. All other </w:t>
       </w:r>
       <w:r>
         <w:rPr>
@@ -33102,7 +33264,25 @@
           <w:sz w:val="20"/>
           <w:szCs w:val="20"/>
         </w:rPr>
-        <w:t xml:space="preserve"> Value is determined by the size of it’s Bandit Camp:</w:t>
+        <w:t xml:space="preserve"> Value is determined by the size of </w:t>
+      </w:r>
+      <w:proofErr w:type="spellStart"/>
+      <w:r>
+        <w:rPr>
+          <w:rFonts w:ascii="EB Garamond" w:hAnsi="EB Garamond" w:cs="EB Garamond"/>
+          <w:sz w:val="20"/>
+          <w:szCs w:val="20"/>
+        </w:rPr>
+        <w:t>it’s</w:t>
+      </w:r>
+      <w:proofErr w:type="spellEnd"/>
+      <w:r>
+        <w:rPr>
+          <w:rFonts w:ascii="EB Garamond" w:hAnsi="EB Garamond" w:cs="EB Garamond"/>
+          <w:sz w:val="20"/>
+          <w:szCs w:val="20"/>
+        </w:rPr>
+        <w:t xml:space="preserve"> Bandit Camp:</w:t>
       </w:r>
     </w:p>
     <w:p>
@@ -33415,7 +33595,25 @@
           <w:sz w:val="20"/>
           <w:szCs w:val="20"/>
         </w:rPr>
-        <w:t xml:space="preserve"> keep Extorted money in it’s </w:t>
+        <w:t xml:space="preserve"> keep Extorted money in </w:t>
+      </w:r>
+      <w:proofErr w:type="spellStart"/>
+      <w:r>
+        <w:rPr>
+          <w:rFonts w:ascii="EB Garamond" w:hAnsi="EB Garamond" w:cs="EB Garamond"/>
+          <w:sz w:val="20"/>
+          <w:szCs w:val="20"/>
+        </w:rPr>
+        <w:t>it’s</w:t>
+      </w:r>
+      <w:proofErr w:type="spellEnd"/>
+      <w:r>
+        <w:rPr>
+          <w:rFonts w:ascii="EB Garamond" w:hAnsi="EB Garamond" w:cs="EB Garamond"/>
+          <w:sz w:val="20"/>
+          <w:szCs w:val="20"/>
+        </w:rPr>
+        <w:t xml:space="preserve"> </w:t>
       </w:r>
       <w:r>
         <w:rPr>
@@ -37284,7 +37482,25 @@
           <w:sz w:val="20"/>
           <w:szCs w:val="20"/>
         </w:rPr>
-        <w:t>Infrastructure is the infrastructure of your settlements. Each infrastructure you have active provides a effect that affects your entire empire and settlements.</w:t>
+        <w:t xml:space="preserve">Infrastructure is the infrastructure of your settlements. Each infrastructure you have active provides </w:t>
+      </w:r>
+      <w:proofErr w:type="spellStart"/>
+      <w:r>
+        <w:rPr>
+          <w:rFonts w:ascii="EB Garamond" w:hAnsi="EB Garamond" w:cs="EB Garamond"/>
+          <w:sz w:val="20"/>
+          <w:szCs w:val="20"/>
+        </w:rPr>
+        <w:t>a</w:t>
+      </w:r>
+      <w:proofErr w:type="spellEnd"/>
+      <w:r>
+        <w:rPr>
+          <w:rFonts w:ascii="EB Garamond" w:hAnsi="EB Garamond" w:cs="EB Garamond"/>
+          <w:sz w:val="20"/>
+          <w:szCs w:val="20"/>
+        </w:rPr>
+        <w:t xml:space="preserve"> effect that affects your entire empire and settlements.</w:t>
       </w:r>
     </w:p>
     <w:p>
@@ -44761,7 +44977,25 @@
           <w:sz w:val="20"/>
           <w:szCs w:val="20"/>
         </w:rPr>
-        <w:t>(ies), or</w:t>
+        <w:t>(</w:t>
+      </w:r>
+      <w:proofErr w:type="spellStart"/>
+      <w:r>
+        <w:rPr>
+          <w:rFonts w:ascii="EB Garamond" w:hAnsi="EB Garamond" w:cs="EB Garamond"/>
+          <w:sz w:val="20"/>
+          <w:szCs w:val="20"/>
+        </w:rPr>
+        <w:t>ies</w:t>
+      </w:r>
+      <w:proofErr w:type="spellEnd"/>
+      <w:r>
+        <w:rPr>
+          <w:rFonts w:ascii="EB Garamond" w:hAnsi="EB Garamond" w:cs="EB Garamond"/>
+          <w:sz w:val="20"/>
+          <w:szCs w:val="20"/>
+        </w:rPr>
+        <w:t>), or</w:t>
       </w:r>
     </w:p>
     <w:p>

</xml_diff>